<commit_message>
Enhance diagram rendering script with improved error handling and customizable theme options; update UML documentation and diagrams for clarity and consistency.
</commit_message>
<xml_diff>
--- a/laravel-vue-mvc/docs/UML_Documentation.docx
+++ b/laravel-vue-mvc/docs/UML_Documentation.docx
@@ -877,7 +877,7 @@
       <w:r>
         <w:drawing>
           <wp:inline xmlns:a="http://schemas.openxmlformats.org/drawingml/2006/main" xmlns:pic="http://schemas.openxmlformats.org/drawingml/2006/picture">
-            <wp:extent cx="5486400" cy="1143960"/>
+            <wp:extent cx="5486400" cy="1273628"/>
             <wp:docPr id="1" name="Picture 1"/>
             <wp:cNvGraphicFramePr>
               <a:graphicFrameLocks noChangeAspect="1"/>
@@ -898,7 +898,7 @@
                   <pic:spPr>
                     <a:xfrm>
                       <a:off x="0" y="0"/>
-                      <a:ext cx="5486400" cy="1143960"/>
+                      <a:ext cx="5486400" cy="1273628"/>
                     </a:xfrm>
                     <a:prstGeom prst="rect"/>
                   </pic:spPr>
@@ -944,7 +944,7 @@
       <w:r>
         <w:drawing>
           <wp:inline xmlns:a="http://schemas.openxmlformats.org/drawingml/2006/main" xmlns:pic="http://schemas.openxmlformats.org/drawingml/2006/picture">
-            <wp:extent cx="5486399" cy="1442609"/>
+            <wp:extent cx="5486400" cy="1582015"/>
             <wp:docPr id="2" name="Picture 2"/>
             <wp:cNvGraphicFramePr>
               <a:graphicFrameLocks noChangeAspect="1"/>
@@ -965,7 +965,7 @@
                   <pic:spPr>
                     <a:xfrm>
                       <a:off x="0" y="0"/>
-                      <a:ext cx="5486399" cy="1442609"/>
+                      <a:ext cx="5486400" cy="1582015"/>
                     </a:xfrm>
                     <a:prstGeom prst="rect"/>
                   </pic:spPr>
@@ -1014,7 +1014,7 @@
       <w:r>
         <w:drawing>
           <wp:inline xmlns:a="http://schemas.openxmlformats.org/drawingml/2006/main" xmlns:pic="http://schemas.openxmlformats.org/drawingml/2006/picture">
-            <wp:extent cx="5486400" cy="4460225"/>
+            <wp:extent cx="5486400" cy="4834307"/>
             <wp:docPr id="3" name="Picture 3"/>
             <wp:cNvGraphicFramePr>
               <a:graphicFrameLocks noChangeAspect="1"/>
@@ -1035,7 +1035,7 @@
                   <pic:spPr>
                     <a:xfrm>
                       <a:off x="0" y="0"/>
-                      <a:ext cx="5486400" cy="4460225"/>
+                      <a:ext cx="5486400" cy="4834307"/>
                     </a:xfrm>
                     <a:prstGeom prst="rect"/>
                   </pic:spPr>
@@ -1076,7 +1076,7 @@
       <w:r>
         <w:drawing>
           <wp:inline xmlns:a="http://schemas.openxmlformats.org/drawingml/2006/main" xmlns:pic="http://schemas.openxmlformats.org/drawingml/2006/picture">
-            <wp:extent cx="5486399" cy="2234725"/>
+            <wp:extent cx="5486400" cy="2374558"/>
             <wp:docPr id="4" name="Picture 4"/>
             <wp:cNvGraphicFramePr>
               <a:graphicFrameLocks noChangeAspect="1"/>
@@ -1097,7 +1097,7 @@
                   <pic:spPr>
                     <a:xfrm>
                       <a:off x="0" y="0"/>
-                      <a:ext cx="5486399" cy="2234725"/>
+                      <a:ext cx="5486400" cy="2374558"/>
                     </a:xfrm>
                     <a:prstGeom prst="rect"/>
                   </pic:spPr>
@@ -1138,7 +1138,7 @@
       <w:r>
         <w:drawing>
           <wp:inline xmlns:a="http://schemas.openxmlformats.org/drawingml/2006/main" xmlns:pic="http://schemas.openxmlformats.org/drawingml/2006/picture">
-            <wp:extent cx="5486400" cy="5353013"/>
+            <wp:extent cx="5486400" cy="5518960"/>
             <wp:docPr id="5" name="Picture 5"/>
             <wp:cNvGraphicFramePr>
               <a:graphicFrameLocks noChangeAspect="1"/>
@@ -1159,7 +1159,7 @@
                   <pic:spPr>
                     <a:xfrm>
                       <a:off x="0" y="0"/>
-                      <a:ext cx="5486400" cy="5353013"/>
+                      <a:ext cx="5486400" cy="5518960"/>
                     </a:xfrm>
                     <a:prstGeom prst="rect"/>
                   </pic:spPr>
@@ -1200,7 +1200,7 @@
       <w:r>
         <w:drawing>
           <wp:inline xmlns:a="http://schemas.openxmlformats.org/drawingml/2006/main" xmlns:pic="http://schemas.openxmlformats.org/drawingml/2006/picture">
-            <wp:extent cx="5486400" cy="1945506"/>
+            <wp:extent cx="5486400" cy="1998496"/>
             <wp:docPr id="6" name="Picture 6"/>
             <wp:cNvGraphicFramePr>
               <a:graphicFrameLocks noChangeAspect="1"/>
@@ -1221,7 +1221,7 @@
                   <pic:spPr>
                     <a:xfrm>
                       <a:off x="0" y="0"/>
-                      <a:ext cx="5486400" cy="1945506"/>
+                      <a:ext cx="5486400" cy="1998496"/>
                     </a:xfrm>
                     <a:prstGeom prst="rect"/>
                   </pic:spPr>
@@ -1262,7 +1262,7 @@
       <w:r>
         <w:drawing>
           <wp:inline xmlns:a="http://schemas.openxmlformats.org/drawingml/2006/main" xmlns:pic="http://schemas.openxmlformats.org/drawingml/2006/picture">
-            <wp:extent cx="5486400" cy="2210120"/>
+            <wp:extent cx="5486400" cy="2409675"/>
             <wp:docPr id="7" name="Picture 7"/>
             <wp:cNvGraphicFramePr>
               <a:graphicFrameLocks noChangeAspect="1"/>
@@ -1283,7 +1283,7 @@
                   <pic:spPr>
                     <a:xfrm>
                       <a:off x="0" y="0"/>
-                      <a:ext cx="5486400" cy="2210120"/>
+                      <a:ext cx="5486400" cy="2409675"/>
                     </a:xfrm>
                     <a:prstGeom prst="rect"/>
                   </pic:spPr>
@@ -1324,7 +1324,7 @@
       <w:r>
         <w:drawing>
           <wp:inline xmlns:a="http://schemas.openxmlformats.org/drawingml/2006/main" xmlns:pic="http://schemas.openxmlformats.org/drawingml/2006/picture">
-            <wp:extent cx="5486400" cy="4357254"/>
+            <wp:extent cx="5486400" cy="4555744"/>
             <wp:docPr id="8" name="Picture 8"/>
             <wp:cNvGraphicFramePr>
               <a:graphicFrameLocks noChangeAspect="1"/>
@@ -1345,7 +1345,7 @@
                   <pic:spPr>
                     <a:xfrm>
                       <a:off x="0" y="0"/>
-                      <a:ext cx="5486400" cy="4357254"/>
+                      <a:ext cx="5486400" cy="4555744"/>
                     </a:xfrm>
                     <a:prstGeom prst="rect"/>
                   </pic:spPr>
@@ -1386,7 +1386,7 @@
       <w:r>
         <w:drawing>
           <wp:inline xmlns:a="http://schemas.openxmlformats.org/drawingml/2006/main" xmlns:pic="http://schemas.openxmlformats.org/drawingml/2006/picture">
-            <wp:extent cx="5486399" cy="1733892"/>
+            <wp:extent cx="5486400" cy="1893536"/>
             <wp:docPr id="9" name="Picture 9"/>
             <wp:cNvGraphicFramePr>
               <a:graphicFrameLocks noChangeAspect="1"/>
@@ -1407,7 +1407,7 @@
                   <pic:spPr>
                     <a:xfrm>
                       <a:off x="0" y="0"/>
-                      <a:ext cx="5486399" cy="1733892"/>
+                      <a:ext cx="5486400" cy="1893536"/>
                     </a:xfrm>
                     <a:prstGeom prst="rect"/>
                   </pic:spPr>
@@ -1448,7 +1448,7 @@
       <w:r>
         <w:drawing>
           <wp:inline xmlns:a="http://schemas.openxmlformats.org/drawingml/2006/main" xmlns:pic="http://schemas.openxmlformats.org/drawingml/2006/picture">
-            <wp:extent cx="5486400" cy="1757082"/>
+            <wp:extent cx="5486400" cy="1822405"/>
             <wp:docPr id="10" name="Picture 10"/>
             <wp:cNvGraphicFramePr>
               <a:graphicFrameLocks noChangeAspect="1"/>
@@ -1469,7 +1469,7 @@
                   <pic:spPr>
                     <a:xfrm>
                       <a:off x="0" y="0"/>
-                      <a:ext cx="5486400" cy="1757082"/>
+                      <a:ext cx="5486400" cy="1822405"/>
                     </a:xfrm>
                     <a:prstGeom prst="rect"/>
                   </pic:spPr>
@@ -1510,7 +1510,7 @@
       <w:r>
         <w:drawing>
           <wp:inline xmlns:a="http://schemas.openxmlformats.org/drawingml/2006/main" xmlns:pic="http://schemas.openxmlformats.org/drawingml/2006/picture">
-            <wp:extent cx="5486400" cy="3955409"/>
+            <wp:extent cx="5486400" cy="4169864"/>
             <wp:docPr id="11" name="Picture 11"/>
             <wp:cNvGraphicFramePr>
               <a:graphicFrameLocks noChangeAspect="1"/>
@@ -1531,7 +1531,7 @@
                   <pic:spPr>
                     <a:xfrm>
                       <a:off x="0" y="0"/>
-                      <a:ext cx="5486400" cy="3955409"/>
+                      <a:ext cx="5486400" cy="4169864"/>
                     </a:xfrm>
                     <a:prstGeom prst="rect"/>
                   </pic:spPr>
@@ -1572,7 +1572,7 @@
       <w:r>
         <w:drawing>
           <wp:inline xmlns:a="http://schemas.openxmlformats.org/drawingml/2006/main" xmlns:pic="http://schemas.openxmlformats.org/drawingml/2006/picture">
-            <wp:extent cx="5486400" cy="2155371"/>
+            <wp:extent cx="5486400" cy="2282157"/>
             <wp:docPr id="12" name="Picture 12"/>
             <wp:cNvGraphicFramePr>
               <a:graphicFrameLocks noChangeAspect="1"/>
@@ -1593,7 +1593,7 @@
                   <pic:spPr>
                     <a:xfrm>
                       <a:off x="0" y="0"/>
-                      <a:ext cx="5486400" cy="2155371"/>
+                      <a:ext cx="5486400" cy="2282157"/>
                     </a:xfrm>
                     <a:prstGeom prst="rect"/>
                   </pic:spPr>
@@ -1634,7 +1634,7 @@
       <w:r>
         <w:drawing>
           <wp:inline xmlns:a="http://schemas.openxmlformats.org/drawingml/2006/main" xmlns:pic="http://schemas.openxmlformats.org/drawingml/2006/picture">
-            <wp:extent cx="5486400" cy="4422227"/>
+            <wp:extent cx="5486400" cy="4639767"/>
             <wp:docPr id="13" name="Picture 13"/>
             <wp:cNvGraphicFramePr>
               <a:graphicFrameLocks noChangeAspect="1"/>
@@ -1655,7 +1655,7 @@
                   <pic:spPr>
                     <a:xfrm>
                       <a:off x="0" y="0"/>
-                      <a:ext cx="5486400" cy="4422227"/>
+                      <a:ext cx="5486400" cy="4639767"/>
                     </a:xfrm>
                     <a:prstGeom prst="rect"/>
                   </pic:spPr>
@@ -1709,7 +1709,7 @@
       <w:r>
         <w:drawing>
           <wp:inline xmlns:a="http://schemas.openxmlformats.org/drawingml/2006/main" xmlns:pic="http://schemas.openxmlformats.org/drawingml/2006/picture">
-            <wp:extent cx="5486400" cy="700207"/>
+            <wp:extent cx="5486400" cy="717496"/>
             <wp:docPr id="14" name="Picture 14"/>
             <wp:cNvGraphicFramePr>
               <a:graphicFrameLocks noChangeAspect="1"/>
@@ -1730,7 +1730,7 @@
                   <pic:spPr>
                     <a:xfrm>
                       <a:off x="0" y="0"/>
-                      <a:ext cx="5486400" cy="700207"/>
+                      <a:ext cx="5486400" cy="717496"/>
                     </a:xfrm>
                     <a:prstGeom prst="rect"/>
                   </pic:spPr>
@@ -1771,7 +1771,7 @@
       <w:r>
         <w:drawing>
           <wp:inline xmlns:a="http://schemas.openxmlformats.org/drawingml/2006/main" xmlns:pic="http://schemas.openxmlformats.org/drawingml/2006/picture">
-            <wp:extent cx="5486400" cy="671392"/>
+            <wp:extent cx="5486400" cy="628169"/>
             <wp:docPr id="15" name="Picture 15"/>
             <wp:cNvGraphicFramePr>
               <a:graphicFrameLocks noChangeAspect="1"/>
@@ -1792,7 +1792,7 @@
                   <pic:spPr>
                     <a:xfrm>
                       <a:off x="0" y="0"/>
-                      <a:ext cx="5486400" cy="671392"/>
+                      <a:ext cx="5486400" cy="628169"/>
                     </a:xfrm>
                     <a:prstGeom prst="rect"/>
                   </pic:spPr>
@@ -1833,7 +1833,7 @@
       <w:r>
         <w:drawing>
           <wp:inline xmlns:a="http://schemas.openxmlformats.org/drawingml/2006/main" xmlns:pic="http://schemas.openxmlformats.org/drawingml/2006/picture">
-            <wp:extent cx="5486400" cy="559013"/>
+            <wp:extent cx="5486400" cy="553250"/>
             <wp:docPr id="16" name="Picture 16"/>
             <wp:cNvGraphicFramePr>
               <a:graphicFrameLocks noChangeAspect="1"/>
@@ -1854,7 +1854,7 @@
                   <pic:spPr>
                     <a:xfrm>
                       <a:off x="0" y="0"/>
-                      <a:ext cx="5486400" cy="559013"/>
+                      <a:ext cx="5486400" cy="553250"/>
                     </a:xfrm>
                     <a:prstGeom prst="rect"/>
                   </pic:spPr>
@@ -1895,7 +1895,7 @@
       <w:r>
         <w:drawing>
           <wp:inline xmlns:a="http://schemas.openxmlformats.org/drawingml/2006/main" xmlns:pic="http://schemas.openxmlformats.org/drawingml/2006/picture">
-            <wp:extent cx="5486400" cy="1334140"/>
+            <wp:extent cx="5486400" cy="1305325"/>
             <wp:docPr id="17" name="Picture 17"/>
             <wp:cNvGraphicFramePr>
               <a:graphicFrameLocks noChangeAspect="1"/>
@@ -1916,7 +1916,7 @@
                   <pic:spPr>
                     <a:xfrm>
                       <a:off x="0" y="0"/>
-                      <a:ext cx="5486400" cy="1334140"/>
+                      <a:ext cx="5486400" cy="1305325"/>
                     </a:xfrm>
                     <a:prstGeom prst="rect"/>
                   </pic:spPr>
@@ -1957,7 +1957,7 @@
       <w:r>
         <w:drawing>
           <wp:inline xmlns:a="http://schemas.openxmlformats.org/drawingml/2006/main" xmlns:pic="http://schemas.openxmlformats.org/drawingml/2006/picture">
-            <wp:extent cx="5486400" cy="916321"/>
+            <wp:extent cx="5486400" cy="875979"/>
             <wp:docPr id="18" name="Picture 18"/>
             <wp:cNvGraphicFramePr>
               <a:graphicFrameLocks noChangeAspect="1"/>
@@ -1978,7 +1978,7 @@
                   <pic:spPr>
                     <a:xfrm>
                       <a:off x="0" y="0"/>
-                      <a:ext cx="5486400" cy="916321"/>
+                      <a:ext cx="5486400" cy="875979"/>
                     </a:xfrm>
                     <a:prstGeom prst="rect"/>
                   </pic:spPr>
@@ -2019,7 +2019,7 @@
       <w:r>
         <w:drawing>
           <wp:inline xmlns:a="http://schemas.openxmlformats.org/drawingml/2006/main" xmlns:pic="http://schemas.openxmlformats.org/drawingml/2006/picture">
-            <wp:extent cx="5486400" cy="953780"/>
+            <wp:extent cx="5486400" cy="795297"/>
             <wp:docPr id="19" name="Picture 19"/>
             <wp:cNvGraphicFramePr>
               <a:graphicFrameLocks noChangeAspect="1"/>
@@ -2040,7 +2040,7 @@
                   <pic:spPr>
                     <a:xfrm>
                       <a:off x="0" y="0"/>
-                      <a:ext cx="5486400" cy="953780"/>
+                      <a:ext cx="5486400" cy="795297"/>
                     </a:xfrm>
                     <a:prstGeom prst="rect"/>
                   </pic:spPr>
@@ -2081,7 +2081,7 @@
       <w:r>
         <w:drawing>
           <wp:inline xmlns:a="http://schemas.openxmlformats.org/drawingml/2006/main" xmlns:pic="http://schemas.openxmlformats.org/drawingml/2006/picture">
-            <wp:extent cx="5486400" cy="461042"/>
+            <wp:extent cx="5486400" cy="469686"/>
             <wp:docPr id="20" name="Picture 20"/>
             <wp:cNvGraphicFramePr>
               <a:graphicFrameLocks noChangeAspect="1"/>
@@ -2102,7 +2102,7 @@
                   <pic:spPr>
                     <a:xfrm>
                       <a:off x="0" y="0"/>
-                      <a:ext cx="5486400" cy="461042"/>
+                      <a:ext cx="5486400" cy="469686"/>
                     </a:xfrm>
                     <a:prstGeom prst="rect"/>
                   </pic:spPr>
@@ -2143,7 +2143,7 @@
       <w:r>
         <w:drawing>
           <wp:inline xmlns:a="http://schemas.openxmlformats.org/drawingml/2006/main" xmlns:pic="http://schemas.openxmlformats.org/drawingml/2006/picture">
-            <wp:extent cx="5486400" cy="1296680"/>
+            <wp:extent cx="5486400" cy="1302443"/>
             <wp:docPr id="21" name="Picture 21"/>
             <wp:cNvGraphicFramePr>
               <a:graphicFrameLocks noChangeAspect="1"/>
@@ -2164,7 +2164,7 @@
                   <pic:spPr>
                     <a:xfrm>
                       <a:off x="0" y="0"/>
-                      <a:ext cx="5486400" cy="1296680"/>
+                      <a:ext cx="5486400" cy="1302443"/>
                     </a:xfrm>
                     <a:prstGeom prst="rect"/>
                   </pic:spPr>
@@ -2205,7 +2205,7 @@
       <w:r>
         <w:drawing>
           <wp:inline xmlns:a="http://schemas.openxmlformats.org/drawingml/2006/main" xmlns:pic="http://schemas.openxmlformats.org/drawingml/2006/picture">
-            <wp:extent cx="5486400" cy="1002766"/>
+            <wp:extent cx="5486400" cy="927847"/>
             <wp:docPr id="22" name="Picture 22"/>
             <wp:cNvGraphicFramePr>
               <a:graphicFrameLocks noChangeAspect="1"/>
@@ -2226,7 +2226,7 @@
                   <pic:spPr>
                     <a:xfrm>
                       <a:off x="0" y="0"/>
-                      <a:ext cx="5486400" cy="1002766"/>
+                      <a:ext cx="5486400" cy="927847"/>
                     </a:xfrm>
                     <a:prstGeom prst="rect"/>
                   </pic:spPr>
@@ -2267,7 +2267,7 @@
       <w:r>
         <w:drawing>
           <wp:inline xmlns:a="http://schemas.openxmlformats.org/drawingml/2006/main" xmlns:pic="http://schemas.openxmlformats.org/drawingml/2006/picture">
-            <wp:extent cx="5486400" cy="760719"/>
+            <wp:extent cx="5486400" cy="780889"/>
             <wp:docPr id="23" name="Picture 23"/>
             <wp:cNvGraphicFramePr>
               <a:graphicFrameLocks noChangeAspect="1"/>
@@ -2288,7 +2288,7 @@
                   <pic:spPr>
                     <a:xfrm>
                       <a:off x="0" y="0"/>
-                      <a:ext cx="5486400" cy="760719"/>
+                      <a:ext cx="5486400" cy="780889"/>
                     </a:xfrm>
                     <a:prstGeom prst="rect"/>
                   </pic:spPr>
@@ -2329,7 +2329,7 @@
       <w:r>
         <w:drawing>
           <wp:inline xmlns:a="http://schemas.openxmlformats.org/drawingml/2006/main" xmlns:pic="http://schemas.openxmlformats.org/drawingml/2006/picture">
-            <wp:extent cx="5486400" cy="881742"/>
+            <wp:extent cx="5486400" cy="824112"/>
             <wp:docPr id="24" name="Picture 24"/>
             <wp:cNvGraphicFramePr>
               <a:graphicFrameLocks noChangeAspect="1"/>
@@ -2350,7 +2350,7 @@
                   <pic:spPr>
                     <a:xfrm>
                       <a:off x="0" y="0"/>
-                      <a:ext cx="5486400" cy="881742"/>
+                      <a:ext cx="5486400" cy="824112"/>
                     </a:xfrm>
                     <a:prstGeom prst="rect"/>
                   </pic:spPr>
@@ -2391,7 +2391,7 @@
       <w:r>
         <w:drawing>
           <wp:inline xmlns:a="http://schemas.openxmlformats.org/drawingml/2006/main" xmlns:pic="http://schemas.openxmlformats.org/drawingml/2006/picture">
-            <wp:extent cx="5486400" cy="691563"/>
+            <wp:extent cx="5486400" cy="714615"/>
             <wp:docPr id="25" name="Picture 25"/>
             <wp:cNvGraphicFramePr>
               <a:graphicFrameLocks noChangeAspect="1"/>
@@ -2412,7 +2412,7 @@
                   <pic:spPr>
                     <a:xfrm>
                       <a:off x="0" y="0"/>
-                      <a:ext cx="5486400" cy="691563"/>
+                      <a:ext cx="5486400" cy="714615"/>
                     </a:xfrm>
                     <a:prstGeom prst="rect"/>
                   </pic:spPr>
@@ -2458,7 +2458,7 @@
       <w:r>
         <w:drawing>
           <wp:inline xmlns:a="http://schemas.openxmlformats.org/drawingml/2006/main" xmlns:pic="http://schemas.openxmlformats.org/drawingml/2006/picture">
-            <wp:extent cx="5486400" cy="1553135"/>
+            <wp:extent cx="5486400" cy="1404025"/>
             <wp:docPr id="26" name="Picture 26"/>
             <wp:cNvGraphicFramePr>
               <a:graphicFrameLocks noChangeAspect="1"/>
@@ -2479,7 +2479,7 @@
                   <pic:spPr>
                     <a:xfrm>
                       <a:off x="0" y="0"/>
-                      <a:ext cx="5486400" cy="1553135"/>
+                      <a:ext cx="5486400" cy="1404025"/>
                     </a:xfrm>
                     <a:prstGeom prst="rect"/>
                   </pic:spPr>
@@ -2520,7 +2520,7 @@
       <w:r>
         <w:drawing>
           <wp:inline xmlns:a="http://schemas.openxmlformats.org/drawingml/2006/main" xmlns:pic="http://schemas.openxmlformats.org/drawingml/2006/picture">
-            <wp:extent cx="5486400" cy="7301564"/>
+            <wp:extent cx="5404707" cy="7498079"/>
             <wp:docPr id="27" name="Picture 27"/>
             <wp:cNvGraphicFramePr>
               <a:graphicFrameLocks noChangeAspect="1"/>
@@ -2541,7 +2541,7 @@
                   <pic:spPr>
                     <a:xfrm>
                       <a:off x="0" y="0"/>
-                      <a:ext cx="5486400" cy="7301564"/>
+                      <a:ext cx="5404707" cy="7498079"/>
                     </a:xfrm>
                     <a:prstGeom prst="rect"/>
                   </pic:spPr>
@@ -3008,7 +3008,7 @@
       <w:r>
         <w:drawing>
           <wp:inline xmlns:a="http://schemas.openxmlformats.org/drawingml/2006/main" xmlns:pic="http://schemas.openxmlformats.org/drawingml/2006/picture">
-            <wp:extent cx="5012979" cy="7498079"/>
+            <wp:extent cx="4912535" cy="7498079"/>
             <wp:docPr id="28" name="Picture 28"/>
             <wp:cNvGraphicFramePr>
               <a:graphicFrameLocks noChangeAspect="1"/>
@@ -3029,7 +3029,7 @@
                   <pic:spPr>
                     <a:xfrm>
                       <a:off x="0" y="0"/>
-                      <a:ext cx="5012979" cy="7498079"/>
+                      <a:ext cx="4912535" cy="7498079"/>
                     </a:xfrm>
                     <a:prstGeom prst="rect"/>
                   </pic:spPr>

</xml_diff>